<commit_message>
Fill in Individual Contribution table with the team's tool-based role split
Table 8 previously read 'To be confirmed' for all three roles. Filled in
per the team's agreed division of ownership by tool:
- Role A (Ingestion/Kafka) -> Jen Jose Jeeson
- Role B (Analytics/Spark) -> Praneetha Pillai
- Role C (Serving/Hive/dashboard) -> Rupsika Thipparthi

Also reworded the paragraph above the table and its caption to match --
still states plainly that all commits so far are under one GitHub account
since development was collaborative, and that this table is the team's
assigned division of responsibility (including each person's share of
review/testing/reporting from here on), not a claim that git history
shows per-module authorship. Matches PROJECT_PLAN.md's Team Roles section.

Note: report/Line_Watch_Draft_Report.pdf was not regenerated (no
LibreOffice/Word available in this environment) -- needs a re-export
from the updated docx before it's back in sync.
</commit_message>
<xml_diff>
--- a/report/Line_Watch_Draft_Report.docx
+++ b/report/Line_Watch_Draft_Report.docx
@@ -461,13 +461,7 @@
         <w:t xml:space="preserve">betting-line divergence</w:t>
       </w:r>
       <w:r>
-        <w:t xml:space="preserve">. In </w:t>
-      </w:r>
-      <w:r>
-        <w:t xml:space="preserve">streaming/divergence_job.py</w:t>
-      </w:r>
-      <w:r>
-        <w:t xml:space="preserve"> it is defined for each match and five-minute window as:</w:t>
+        <w:t xml:space="preserve">. In streaming/divergence_job.py it is defined for each match and five-minute window as:</w:t>
       </w:r>
     </w:p>
     <w:p>
@@ -490,16 +484,7 @@
         <w:jc w:val="both"/>
       </w:pPr>
       <w:r>
-        <w:t xml:space="preserve">actual_move</w:t>
-      </w:r>
-      <w:r>
-        <w:t xml:space="preserve"> is how much the implied probabilities really moved in the window and </w:t>
-      </w:r>
-      <w:r>
-        <w:t xml:space="preserve">expected_move</w:t>
-      </w:r>
-      <w:r>
-        <w:t xml:space="preserve"> is how much they should have moved given its events. A value near zero or below means the events explain the movement; above 0.05 the window is flagged. The system follows Track D of the course guidelines (Kafka, Spark Streaming, Hive/HDFS) with a Streamlit dashboard on top.</w:t>
+        <w:t xml:space="preserve">actual_move is how much the implied probabilities really moved in the window and expected_move is how much they should have moved given its events. A value near zero or below means the events explain the movement; above 0.05 the window is flagged. The system follows Track D of the course guidelines (Kafka, Spark Streaming, Hive/HDFS) with a Streamlit dashboard on top.</w:t>
       </w:r>
     </w:p>
     <w:p>
@@ -599,25 +584,7 @@
         <w:jc w:val="both"/>
       </w:pPr>
       <w:r>
-        <w:t xml:space="preserve">Stream odds and events through two Kafka topics, </w:t>
-      </w:r>
-      <w:r>
-        <w:t xml:space="preserve">odds-ticks</w:t>
-      </w:r>
-      <w:r>
-        <w:t xml:space="preserve"> and </w:t>
-      </w:r>
-      <w:r>
-        <w:t xml:space="preserve">match-events</w:t>
-      </w:r>
-      <w:r>
-        <w:t xml:space="preserve">, keyed by a shared </w:t>
-      </w:r>
-      <w:r>
-        <w:t xml:space="preserve">match_id</w:t>
-      </w:r>
-      <w:r>
-        <w:t xml:space="preserve">.</w:t>
+        <w:t xml:space="preserve">Stream odds and events through two Kafka topics, odds-ticks and match-events, keyed by a shared match_id.</w:t>
       </w:r>
     </w:p>
     <w:p>
@@ -698,28 +665,7 @@
         <w:jc w:val="both"/>
       </w:pPr>
       <w:r>
-        <w:t xml:space="preserve">fetch_odds_data.py</w:t>
-      </w:r>
-      <w:r>
-        <w:t xml:space="preserve"> downloads the free CSV </w:t>
-      </w:r>
-      <w:r>
-        <w:t xml:space="preserve">football-data.co.uk/mmz4281/2324/E0.csv</w:t>
-      </w:r>
-      <w:r>
-        <w:t xml:space="preserve"> (Premier League 2023/24, one row per match) to </w:t>
-      </w:r>
-      <w:r>
-        <w:t xml:space="preserve">data/raw/E0_2324.csv</w:t>
-      </w:r>
-      <w:r>
-        <w:t xml:space="preserve">; </w:t>
-      </w:r>
-      <w:r>
-        <w:t xml:space="preserve">odds_producer.py</w:t>
-      </w:r>
-      <w:r>
-        <w:t xml:space="preserve"> uses the Bet365 columns in Table 1. Only pre-match and closing lines are available, so the odds in between are modelled (Section 8), a stated assumption of the project.</w:t>
+        <w:t xml:space="preserve">fetch_odds_data.py downloads the free CSV football-data.co.uk/mmz4281/2324/E0.csv (Premier League 2023/24, one row per match) to data/raw/E0_2324.csv; odds_producer.py uses the Bet365 columns in Table 1. Only pre-match and closing lines are available, so the odds in between are modelled (Section 8), a stated assumption of the project.</w:t>
       </w:r>
     </w:p>
     <w:p>
@@ -1481,34 +1427,7 @@
         <w:jc w:val="both"/>
       </w:pPr>
       <w:r>
-        <w:t xml:space="preserve">events_producer.py</w:t>
-      </w:r>
-      <w:r>
-        <w:t xml:space="preserve"> calls API-Football v3 </w:t>
-      </w:r>
-      <w:r>
-        <w:t xml:space="preserve">GET /fixtures/events?fixture=&lt;id&gt;</w:t>
-      </w:r>
-      <w:r>
-        <w:t xml:space="preserve"> (free tier, ~100 requests/day). Raw types are normalised: </w:t>
-      </w:r>
-      <w:r>
-        <w:t xml:space="preserve">goal</w:t>
-      </w:r>
-      <w:r>
-        <w:t xml:space="preserve"> becomes Goal, or Penalty Missed if the detail says "missed"; </w:t>
-      </w:r>
-      <w:r>
-        <w:t xml:space="preserve">card</w:t>
-      </w:r>
-      <w:r>
-        <w:t xml:space="preserve"> becomes Red Card (including a second yellow) or Yellow Card; </w:t>
-      </w:r>
-      <w:r>
-        <w:t xml:space="preserve">subst</w:t>
-      </w:r>
-      <w:r>
-        <w:t xml:space="preserve"> becomes Substitution; anything else, such as VAR entries, is dropped because it duplicates an event already recorded. Stoppage-time events are clipped to minute 90, and results are cached locally. For Burnley 0-3 Manchester City (fixture 1035037, 11 August 2023) the API returns 15 raw events, which normalise to 14: 3 goals, 1 red card and 10 substitutions.</w:t>
+        <w:t xml:space="preserve">events_producer.py calls API-Football v3 GET /fixtures/events?fixture=&lt;id&gt; (free tier, ~100 requests/day). Raw types are normalised: goal becomes Goal, or Penalty Missed if the detail says "missed"; card becomes Red Card (including a second yellow) or Yellow Card; subst becomes Substitution; anything else, such as VAR entries, is dropped because it duplicates an event already recorded. Stoppage-time events are clipped to minute 90, and results are cached locally. For Burnley 0-3 Manchester City (fixture 1035037, 11 August 2023) the API returns 15 raw events, which normalise to 14: 3 goals, 1 red card and 10 substitutions.</w:t>
       </w:r>
     </w:p>
     <w:p>
@@ -1525,16 +1444,7 @@
         <w:jc w:val="both"/>
       </w:pPr>
       <w:r>
-        <w:t xml:space="preserve">producers/synthetic_leak_demo.py</w:t>
-      </w:r>
-      <w:r>
-        <w:t xml:space="preserve"> publishes one hand-built case with </w:t>
-      </w:r>
-      <w:r>
-        <w:t xml:space="preserve">match_id = "SYNTH-LEAK-DEMO"</w:t>
-      </w:r>
-      <w:r>
-        <w:t xml:space="preserve">, a non-numeric id so it cannot be confused with a real fixture. We added it because a detector that never fires looks the same as a broken one. Home odds stay at 3.0 until minute 34 and crash to 1.8 in minutes 35 to 39 with no event nearby; the goal that would explain this comes only at minute 50, deliberately late, as if the market already knew. Window 35 should be flagged and window 50 should not. In summary, the odds CSV and API events are </w:t>
+        <w:t xml:space="preserve">producers/synthetic_leak_demo.py publishes one hand-built case with match_id = "SYNTH-LEAK-DEMO", a non-numeric id so it cannot be confused with a real fixture. We added it because a detector that never fires looks the same as a broken one. Home odds stay at 3.0 until minute 34 and crash to 1.8 in minutes 35 to 39 with no event nearby; the goal that would explain this comes only at minute 50, deliberately late, as if the market already knew. Window 35 should be flagged and window 50 should not. In summary, the odds CSV and API events are </w:t>
       </w:r>
       <w:r>
         <w:rPr>
@@ -1554,19 +1464,7 @@
         <w:t xml:space="preserve">modelled</w:t>
       </w:r>
       <w:r>
-        <w:t xml:space="preserve"> from real values, and </w:t>
-      </w:r>
-      <w:r>
-        <w:t xml:space="preserve">SYNTH-LEAK-DEMO</w:t>
-      </w:r>
-      <w:r>
-        <w:t xml:space="preserve"> (plus the default </w:t>
-      </w:r>
-      <w:r>
-        <w:t xml:space="preserve">sample_match_events.json</w:t>
-      </w:r>
-      <w:r>
-        <w:t xml:space="preserve">) is </w:t>
+        <w:t xml:space="preserve"> from real values, and SYNTH-LEAK-DEMO (plus the default sample_match_events.json) is </w:t>
       </w:r>
       <w:r>
         <w:rPr>
@@ -2666,13 +2564,7 @@
         <w:t xml:space="preserve">Kafka</w:t>
       </w:r>
       <w:r>
-        <w:t xml:space="preserve"> decouples the two independently timed feeds from the consumer: odds arrive every match-minute, events only when something happens, and the Spark job can start before or after the producers and still read everything from the earliest offset. Keying every message by </w:t>
-      </w:r>
-      <w:r>
-        <w:t xml:space="preserve">match_id</w:t>
-      </w:r>
-      <w:r>
-        <w:t xml:space="preserve"> lets Spark join the two topics per match.</w:t>
+        <w:t xml:space="preserve"> decouples the two independently timed feeds from the consumer: odds arrive every match-minute, events only when something happens, and the Spark job can start before or after the producers and still read everything from the earliest offset. Keying every message by match_id lets Spark join the two topics per match.</w:t>
       </w:r>
     </w:p>
     <w:p>
@@ -2704,13 +2596,7 @@
         <w:t xml:space="preserve">HDFS</w:t>
       </w:r>
       <w:r>
-        <w:t xml:space="preserve"> is the persistent layer between processing and serving. The job writes Parquet under </w:t>
-      </w:r>
-      <w:r>
-        <w:t xml:space="preserve">hdfs://namenode:8020/data/line_watch/</w:t>
-      </w:r>
-      <w:r>
-        <w:t xml:space="preserve">, a columnar format that both Hive and pandas read directly. </w:t>
+        <w:t xml:space="preserve"> is the persistent layer between processing and serving. The job writes Parquet under hdfs://namenode:8020/data/line_watch/, a columnar format that both Hive and pandas read directly. </w:t>
       </w:r>
       <w:r>
         <w:rPr>
@@ -2720,13 +2606,7 @@
         <w:t xml:space="preserve">Hive</w:t>
       </w:r>
       <w:r>
-        <w:t xml:space="preserve"> gives SQL access through three external tables created by </w:t>
-      </w:r>
-      <w:r>
-        <w:t xml:space="preserve">streaming/hive_tables.sql</w:t>
-      </w:r>
-      <w:r>
-        <w:t xml:space="preserve"> (metadata only; data is never copied). </w:t>
+        <w:t xml:space="preserve"> gives SQL access through three external tables created by streaming/hive_tables.sql (metadata only; data is never copied). </w:t>
       </w:r>
       <w:r>
         <w:rPr>
@@ -2736,13 +2616,7 @@
         <w:t xml:space="preserve">PostgreSQL</w:t>
       </w:r>
       <w:r>
-        <w:t xml:space="preserve"> is used only as the Hive metastore database (configured in </w:t>
-      </w:r>
-      <w:r>
-        <w:t xml:space="preserve">hadoop-hive.env</w:t>
-      </w:r>
-      <w:r>
-        <w:t xml:space="preserve">), not for application data.</w:t>
+        <w:t xml:space="preserve"> is used only as the Hive metastore database (configured in hadoop-hive.env), not for application data.</w:t>
       </w:r>
     </w:p>
     <w:p>
@@ -2758,13 +2632,7 @@
         <w:t xml:space="preserve">Streamlit</w:t>
       </w:r>
       <w:r>
-        <w:t xml:space="preserve"> gave us a web dashboard in one Python file (</w:t>
-      </w:r>
-      <w:r>
-        <w:t xml:space="preserve">dashboard/app.py</w:t>
-      </w:r>
-      <w:r>
-        <w:t xml:space="preserve">), and </w:t>
+        <w:t xml:space="preserve"> gave us a web dashboard in one Python file (dashboard/app.py), and </w:t>
       </w:r>
       <w:r>
         <w:rPr>
@@ -2895,19 +2763,7 @@
         <w:t xml:space="preserve">Stage 1: Data acquisition.</w:t>
       </w:r>
       <w:r>
-        <w:t xml:space="preserve"> Running </w:t>
-      </w:r>
-      <w:r>
-        <w:t xml:space="preserve">fetch_odds_data.py</w:t>
-      </w:r>
-      <w:r>
-        <w:t xml:space="preserve"> for division E0 and season 2324 saves the season CSV as </w:t>
-      </w:r>
-      <w:r>
-        <w:t xml:space="preserve">data/raw/E0_2324.csv</w:t>
-      </w:r>
-      <w:r>
-        <w:t xml:space="preserve">.</w:t>
+        <w:t xml:space="preserve"> Running fetch_odds_data.py for division E0 and season 2324 saves the season CSV as data/raw/E0_2324.csv.</w:t>
       </w:r>
     </w:p>
     <w:p>
@@ -2923,25 +2779,7 @@
         <w:t xml:space="preserve">Stage 2: Fixture identification.</w:t>
       </w:r>
       <w:r>
-        <w:t xml:space="preserve"> </w:t>
-      </w:r>
-      <w:r>
-        <w:t xml:space="preserve">find_fixture.py --team Burnley --date 2023-08-11</w:t>
-      </w:r>
-      <w:r>
-        <w:t xml:space="preserve"> returns the API-Football fixture id (1035037). A canonical </w:t>
-      </w:r>
-      <w:r>
-        <w:t xml:space="preserve">match_id</w:t>
-      </w:r>
-      <w:r>
-        <w:t xml:space="preserve"> is needed because the sources spell team names differently ("Man City" and "Manchester City"). Otherwise the topics would carry different keys and the join would silently match nothing, so both producers get the same </w:t>
-      </w:r>
-      <w:r>
-        <w:t xml:space="preserve">--match-id</w:t>
-      </w:r>
-      <w:r>
-        <w:t xml:space="preserve">.</w:t>
+        <w:t xml:space="preserve"> find_fixture.py --team Burnley --date 2023-08-11 returns the API-Football fixture id (1035037). A canonical match_id is needed because the sources spell team names differently ("Man City" and "Manchester City"). Otherwise the topics would carry different keys and the join would silently match nothing, so both producers get the same --match-id.</w:t>
       </w:r>
     </w:p>
     <w:p>
@@ -2957,13 +2795,7 @@
         <w:t xml:space="preserve">Stage 3: Odds interpolation.</w:t>
       </w:r>
       <w:r>
-        <w:t xml:space="preserve"> </w:t>
-      </w:r>
-      <w:r>
-        <w:t xml:space="preserve">interpolate_odds()</w:t>
-      </w:r>
-      <w:r>
-        <w:t xml:space="preserve"> turns the opening odds, closing odds and events into 91 ticks. It works in de-vigged probability space, since probability is what events change. A weight </w:t>
+        <w:t xml:space="preserve"> interpolate_odds() turns the opening odds, closing odds and events into 91 ticks. It works in de-vigged probability space, since probability is what events change. A weight </w:t>
       </w:r>
       <w:r>
         <w:rPr>
@@ -3034,13 +2866,7 @@
         <w:jc w:val="both"/>
       </w:pPr>
       <w:r>
-        <w:t xml:space="preserve">The 0.3 term is background drift; the sigmoids create steps at event minutes, weighted by </w:t>
-      </w:r>
-      <w:r>
-        <w:t xml:space="preserve">EVENT_WEIGHTS</w:t>
-      </w:r>
-      <w:r>
-        <w:t xml:space="preserve"> (Table 3). The first and last ticks equal the real opening and closing odds.</w:t>
+        <w:t xml:space="preserve">The 0.3 term is background drift; the sigmoids create steps at event minutes, weighted by EVENT_WEIGHTS (Table 3). The first and last ticks equal the real opening and closing odds.</w:t>
       </w:r>
     </w:p>
     <w:p>
@@ -3056,25 +2882,7 @@
         <w:t xml:space="preserve">Stages 4 and 5: Event normalisation and Kafka ingestion.</w:t>
       </w:r>
       <w:r>
-        <w:t xml:space="preserve"> Events are normalised as in Section 4.2. Both producers send JSON keyed by </w:t>
-      </w:r>
-      <w:r>
-        <w:t xml:space="preserve">match_id</w:t>
-      </w:r>
-      <w:r>
-        <w:t xml:space="preserve">: </w:t>
-      </w:r>
-      <w:r>
-        <w:t xml:space="preserve">odds-ticks</w:t>
-      </w:r>
-      <w:r>
-        <w:t xml:space="preserve"> carries {match_id, minute, home_odds, draw_odds, away_odds, produced_at} and </w:t>
-      </w:r>
-      <w:r>
-        <w:t xml:space="preserve">match-events</w:t>
-      </w:r>
-      <w:r>
-        <w:t xml:space="preserve"> carries {match_id, minute, type, team, player, produced_at}.</w:t>
+        <w:t xml:space="preserve"> Events are normalised as in Section 4.2. Both producers send JSON keyed by match_id: odds-ticks carries {match_id, minute, home_odds, draw_odds, away_odds, produced_at} and match-events carries {match_id, minute, type, team, player, produced_at}.</w:t>
       </w:r>
     </w:p>
     <w:p>
@@ -3090,37 +2898,7 @@
         <w:t xml:space="preserve">Stage 6: Spark processing.</w:t>
       </w:r>
       <w:r>
-        <w:t xml:space="preserve"> The job reads both topics from the earliest offset, parses them with </w:t>
-      </w:r>
-      <w:r>
-        <w:t xml:space="preserve">from_json</w:t>
-      </w:r>
-      <w:r>
-        <w:t xml:space="preserve">, and adds </w:t>
-      </w:r>
-      <w:r>
-        <w:t xml:space="preserve">window_start</w:t>
-      </w:r>
-      <w:r>
-        <w:t xml:space="preserve"> (and </w:t>
-      </w:r>
-      <w:r>
-        <w:t xml:space="preserve">expected_shift</w:t>
-      </w:r>
-      <w:r>
-        <w:t xml:space="preserve"> for events). Every 10 seconds a </w:t>
-      </w:r>
-      <w:r>
-        <w:t xml:space="preserve">rate</w:t>
-      </w:r>
-      <w:r>
-        <w:t xml:space="preserve">-source heartbeat re-reads the raw tables and runs </w:t>
-      </w:r>
-      <w:r>
-        <w:t xml:space="preserve">score_divergence()</w:t>
-      </w:r>
-      <w:r>
-        <w:t xml:space="preserve"> (Section 9).</w:t>
+        <w:t xml:space="preserve"> The job reads both topics from the earliest offset, parses them with from_json, and adds window_start (and expected_shift for events). Every 10 seconds a rate-source heartbeat re-reads the raw tables and runs score_divergence() (Section 9).</w:t>
       </w:r>
     </w:p>
     <w:p>
@@ -3136,61 +2914,7 @@
         <w:t xml:space="preserve">Stages 7 to 9: Storage, Hive and dashboard.</w:t>
       </w:r>
       <w:r>
-        <w:t xml:space="preserve"> Raw rows are appended to </w:t>
-      </w:r>
-      <w:r>
-        <w:t xml:space="preserve">odds_ticks_raw</w:t>
-      </w:r>
-      <w:r>
-        <w:t xml:space="preserve"> and </w:t>
-      </w:r>
-      <w:r>
-        <w:t xml:space="preserve">match_events_raw</w:t>
-      </w:r>
-      <w:r>
-        <w:t xml:space="preserve"> and scores overwrite </w:t>
-      </w:r>
-      <w:r>
-        <w:t xml:space="preserve">divergence_scores</w:t>
-      </w:r>
-      <w:r>
-        <w:t xml:space="preserve"> under </w:t>
-      </w:r>
-      <w:r>
-        <w:t xml:space="preserve">/data/line_watch/</w:t>
-      </w:r>
-      <w:r>
-        <w:t xml:space="preserve">; </w:t>
-      </w:r>
-      <w:r>
-        <w:t xml:space="preserve">hive_tables.sql</w:t>
-      </w:r>
-      <w:r>
-        <w:t xml:space="preserve"> creates the external tables; </w:t>
-      </w:r>
-      <w:r>
-        <w:t xml:space="preserve">hdfs_reader.py</w:t>
-      </w:r>
-      <w:r>
-        <w:t xml:space="preserve"> copies tables out with </w:t>
-      </w:r>
-      <w:r>
-        <w:t xml:space="preserve">hdfs dfs -get</w:t>
-      </w:r>
-      <w:r>
-        <w:t xml:space="preserve"> and </w:t>
-      </w:r>
-      <w:r>
-        <w:t xml:space="preserve">docker cp</w:t>
-      </w:r>
-      <w:r>
-        <w:t xml:space="preserve"> for </w:t>
-      </w:r>
-      <w:r>
-        <w:t xml:space="preserve">app.py</w:t>
-      </w:r>
-      <w:r>
-        <w:t xml:space="preserve"> to plot.</w:t>
+        <w:t xml:space="preserve"> Raw rows are appended to odds_ticks_raw and match_events_raw and scores overwrite divergence_scores under /data/line_watch/; hive_tables.sql creates the external tables; hdfs_reader.py copies tables out with hdfs dfs -get and docker cp for app.py to plot.</w:t>
       </w:r>
     </w:p>
     <w:p>
@@ -3207,19 +2931,7 @@
         <w:jc w:val="both"/>
       </w:pPr>
       <w:r>
-        <w:t xml:space="preserve">The scoring logic is </w:t>
-      </w:r>
-      <w:r>
-        <w:t xml:space="preserve">score_divergence()</w:t>
-      </w:r>
-      <w:r>
-        <w:t xml:space="preserve"> in </w:t>
-      </w:r>
-      <w:r>
-        <w:t xml:space="preserve">divergence_job.py</w:t>
-      </w:r>
-      <w:r>
-        <w:t xml:space="preserve">, kept apart from the Kafka and HDFS code so it can be unit tested (Figure 2).</w:t>
+        <w:t xml:space="preserve">The scoring logic is score_divergence() in divergence_job.py, kept apart from the Kafka and HDFS code so it can be unit tested (Figure 2).</w:t>
       </w:r>
     </w:p>
     <w:p>
@@ -3335,13 +3047,7 @@
         <w:t xml:space="preserve">9.2 Five-minute window.</w:t>
       </w:r>
       <w:r>
-        <w:t xml:space="preserve"> </w:t>
-      </w:r>
-      <w:r>
-        <w:t xml:space="preserve">window_start = floor(minute / 5) * 5</w:t>
-      </w:r>
-      <w:r>
-        <w:t xml:space="preserve">, so minutes 35 to 39 form window 35. A match gives 19 windows (0 to 90).</w:t>
+        <w:t xml:space="preserve"> window_start = floor(minute / 5) * 5, so minutes 35 to 39 form window 35. A match gives 19 windows (0 to 90).</w:t>
       </w:r>
     </w:p>
     <w:p>
@@ -3387,13 +3093,7 @@
         <w:t xml:space="preserve">9.4 Expected movement</w:t>
       </w:r>
       <w:r>
-        <w:t xml:space="preserve"> is </w:t>
-      </w:r>
-      <w:r>
-        <w:t xml:space="preserve">expected_move = 0.01 + sum of expected_shift</w:t>
-      </w:r>
-      <w:r>
-        <w:t xml:space="preserve"> over the window's events. The 0.01 allows for a market that is never perfectly still. The priors (Table 3) are deliberately </w:t>
+        <w:t xml:space="preserve"> is expected_move = 0.01 + sum of expected_shift over the window's events. The 0.01 allows for a market that is never perfectly still. The priors (Table 3) are deliberately </w:t>
       </w:r>
       <w:r>
         <w:rPr>
@@ -3403,13 +3103,7 @@
         <w:t xml:space="preserve">not</w:t>
       </w:r>
       <w:r>
-        <w:t xml:space="preserve"> the producer's </w:t>
-      </w:r>
-      <w:r>
-        <w:t xml:space="preserve">EVENT_WEIGHTS</w:t>
-      </w:r>
-      <w:r>
-        <w:t xml:space="preserve">; reusing the table that generated the odds would make divergence near zero by construction.</w:t>
+        <w:t xml:space="preserve"> the producer's EVENT_WEIGHTS; reusing the table that generated the odds would make divergence near zero by construction.</w:t>
       </w:r>
     </w:p>
     <w:p>
@@ -4170,25 +3864,7 @@
         <w:t xml:space="preserve">9.5 Divergence and 9.6 flagging.</w:t>
       </w:r>
       <w:r>
-        <w:t xml:space="preserve"> </w:t>
-      </w:r>
-      <w:r>
-        <w:t xml:space="preserve">divergence_score = actual_move - expected_move</w:t>
-      </w:r>
-      <w:r>
-        <w:t xml:space="preserve">, and </w:t>
-      </w:r>
-      <w:r>
-        <w:t xml:space="preserve">flagged</w:t>
-      </w:r>
-      <w:r>
-        <w:t xml:space="preserve"> is true when the score is above 0.05 (</w:t>
-      </w:r>
-      <w:r>
-        <w:t xml:space="preserve">DIVERGENCE_THRESHOLD</w:t>
-      </w:r>
-      <w:r>
-        <w:t xml:space="preserve">), false otherwise. Actual and expected movement are combined with a </w:t>
+        <w:t xml:space="preserve"> divergence_score = actual_move - expected_move, and flagged is true when the score is above 0.05 (DIVERGENCE_THRESHOLD), false otherwise. Actual and expected movement are combined with a </w:t>
       </w:r>
       <w:r>
         <w:rPr>
@@ -4232,19 +3908,7 @@
         <w:t xml:space="preserve">Synthetic leak case.</w:t>
       </w:r>
       <w:r>
-        <w:t xml:space="preserve"> Table 4 shows the scores for </w:t>
-      </w:r>
-      <w:r>
-        <w:t xml:space="preserve">SYNTH-LEAK-DEMO</w:t>
-      </w:r>
-      <w:r>
-        <w:t xml:space="preserve">. Windows 35 and 50 match </w:t>
-      </w:r>
-      <w:r>
-        <w:t xml:space="preserve">streaming/README.md</w:t>
-      </w:r>
-      <w:r>
-        <w:t xml:space="preserve"> (cluster run); we recomputed all 19 windows offline with the same formulas and got the same values.</w:t>
+        <w:t xml:space="preserve"> Table 4 shows the scores for SYNTH-LEAK-DEMO. Windows 35 and 50 match streaming/README.md (cluster run); we recomputed all 19 windows offline with the same formulas and got the same values.</w:t>
       </w:r>
     </w:p>
     <w:p>
@@ -7040,25 +6704,7 @@
         <w:t xml:space="preserve">Check-in 1: Working ingestion.</w:t>
       </w:r>
       <w:r>
-        <w:t xml:space="preserve"> The producer commits (9247200, 66e4060) are dated 14 September 2026. </w:t>
-      </w:r>
-      <w:r>
-        <w:t xml:space="preserve">producers/README.md</w:t>
-      </w:r>
-      <w:r>
-        <w:t xml:space="preserve"> records 14 real events and 91 odds ticks for fixture 1035037, with both topics carrying key </w:t>
-      </w:r>
-      <w:r>
-        <w:t xml:space="preserve">1035037</w:t>
-      </w:r>
-      <w:r>
-        <w:t xml:space="preserve"> (checked with </w:t>
-      </w:r>
-      <w:r>
-        <w:t xml:space="preserve">kafka-console-consumer</w:t>
-      </w:r>
-      <w:r>
-        <w:t xml:space="preserve">). The repository does not contain a dated progress-check-in record for this stage; the implementation itself demonstrates the completed ingestion stage.</w:t>
+        <w:t xml:space="preserve"> The producer commits (9247200, 66e4060) are dated 14 September 2026. producers/README.md records 14 real events and 91 odds ticks for fixture 1035037, with both topics carrying key 1035037 (checked with kafka-console-consumer). The repository does not contain a dated progress-check-in record for this stage; the implementation itself demonstrates the completed ingestion stage.</w:t>
       </w:r>
     </w:p>
     <w:p>
@@ -7074,13 +6720,7 @@
         <w:t xml:space="preserve">Check-in 2: Draft analytical results.</w:t>
       </w:r>
       <w:r>
-        <w:t xml:space="preserve"> The streaming job (commit 93d53b0) and the synthetic case (commit 8675da6) are dated 21 September 2026. </w:t>
-      </w:r>
-      <w:r>
-        <w:t xml:space="preserve">streaming/README.md</w:t>
-      </w:r>
-      <w:r>
-        <w:t xml:space="preserve"> records 19 unflagged windows for fixture 1035037 and the window-35 flag (+0.184) for the synthetic case. The repository does not contain a dated progress-check-in record for this stage; the implementation itself demonstrates the completed analysis stage.</w:t>
+        <w:t xml:space="preserve"> The streaming job (commit 93d53b0) and the synthetic case (commit 8675da6) are dated 21 September 2026. streaming/README.md records 19 unflagged windows for fixture 1035037 and the window-35 flag (+0.184) for the synthetic case. The repository does not contain a dated progress-check-in record for this stage; the implementation itself demonstrates the completed analysis stage.</w:t>
       </w:r>
     </w:p>
     <w:p>
@@ -7128,13 +6768,7 @@
         <w:t xml:space="preserve">2:00 to 4:00</w:t>
       </w:r>
       <w:r>
-        <w:t xml:space="preserve"> </w:t>
-      </w:r>
-      <w:r>
-        <w:t xml:space="preserve">docker compose up -d</w:t>
-      </w:r>
-      <w:r>
-        <w:t xml:space="preserve">; containers, HDFS UI, Spark UI.</w:t>
+        <w:t xml:space="preserve"> docker compose up -d; containers, HDFS UI, Spark UI.</w:t>
       </w:r>
     </w:p>
     <w:p>
@@ -7155,13 +6789,7 @@
         <w:t xml:space="preserve">4:00 to 5:30</w:t>
       </w:r>
       <w:r>
-        <w:t xml:space="preserve"> Run the three producers; show messages with </w:t>
-      </w:r>
-      <w:r>
-        <w:t xml:space="preserve">kafka-console-consumer</w:t>
-      </w:r>
-      <w:r>
-        <w:t xml:space="preserve">. </w:t>
+        <w:t xml:space="preserve"> Run the three producers; show messages with kafka-console-consumer. </w:t>
       </w:r>
       <w:r>
         <w:rPr>
@@ -7171,13 +6799,7 @@
         <w:t xml:space="preserve">5:30 to 7:00</w:t>
       </w:r>
       <w:r>
-        <w:t xml:space="preserve"> </w:t>
-      </w:r>
-      <w:r>
-        <w:t xml:space="preserve">spark-submit</w:t>
-      </w:r>
-      <w:r>
-        <w:t xml:space="preserve"> the job; show "scored N windows, M flagged".</w:t>
+        <w:t xml:space="preserve"> spark-submit the job; show "scored N windows, M flagged".</w:t>
       </w:r>
     </w:p>
     <w:p>
@@ -7198,13 +6820,7 @@
         <w:t xml:space="preserve">7:00 to 8:00</w:t>
       </w:r>
       <w:r>
-        <w:t xml:space="preserve"> HDFS folders and a beeline query on </w:t>
-      </w:r>
-      <w:r>
-        <w:t xml:space="preserve">divergence_scores</w:t>
-      </w:r>
-      <w:r>
-        <w:t xml:space="preserve">. </w:t>
+        <w:t xml:space="preserve"> HDFS folders and a beeline query on divergence_scores. </w:t>
       </w:r>
       <w:r>
         <w:rPr>
@@ -8156,13 +7772,7 @@
         <w:t xml:space="preserve">Rule-based detector with hand-set priors.</w:t>
       </w:r>
       <w:r>
-        <w:t xml:space="preserve"> </w:t>
-      </w:r>
-      <w:r>
-        <w:t xml:space="preserve">EVENT_SHIFTS</w:t>
-      </w:r>
-      <w:r>
-        <w:t xml:space="preserve"> ignores score and minute. </w:t>
+        <w:t xml:space="preserve"> EVENT_SHIFTS ignores score and minute. </w:t>
       </w:r>
       <w:r>
         <w:rPr>
@@ -8255,31 +7865,7 @@
         <w:t xml:space="preserve">Default event file.</w:t>
       </w:r>
       <w:r>
-        <w:t xml:space="preserve"> Without </w:t>
-      </w:r>
-      <w:r>
-        <w:t xml:space="preserve">--events</w:t>
-      </w:r>
-      <w:r>
-        <w:t xml:space="preserve">, </w:t>
-      </w:r>
-      <w:r>
-        <w:t xml:space="preserve">odds_producer.py</w:t>
-      </w:r>
-      <w:r>
-        <w:t xml:space="preserve"> shapes the curve with the synthetic </w:t>
-      </w:r>
-      <w:r>
-        <w:t xml:space="preserve">sample_match_events.json</w:t>
-      </w:r>
-      <w:r>
-        <w:t xml:space="preserve">, and the README command does not pass it. For real matches </w:t>
-      </w:r>
-      <w:r>
-        <w:t xml:space="preserve">--events data/interim/events/&lt;id&gt;.json</w:t>
-      </w:r>
-      <w:r>
-        <w:t xml:space="preserve"> should be given.</w:t>
+        <w:t xml:space="preserve"> Without --events, odds_producer.py shapes the curve with the synthetic sample_match_events.json, and the README command does not pass it. For real matches --events data/interim/events/&lt;id&gt;.json should be given.</w:t>
       </w:r>
     </w:p>
     <w:p>
@@ -8303,19 +7889,7 @@
         <w:t xml:space="preserve">Proposed, not implemented:</w:t>
       </w:r>
       <w:r>
-        <w:t xml:space="preserve"> a real in-play odds API and several bookmakers; expected movement learned from historical matches, statistical anomaly detection (for example per-window z-scores) or machine-learning models; dynamic thresholds; incremental stateful Spark processing with watermarks; cloud deployment instead of the current single-host Docker setup; and a proper query service instead of the </w:t>
-      </w:r>
-      <w:r>
-        <w:t xml:space="preserve">docker exec</w:t>
-      </w:r>
-      <w:r>
-        <w:t xml:space="preserve">/</w:t>
-      </w:r>
-      <w:r>
-        <w:t xml:space="preserve">docker cp</w:t>
-      </w:r>
-      <w:r>
-        <w:t xml:space="preserve"> dashboard workaround.</w:t>
+        <w:t xml:space="preserve"> a real in-play odds API and several bookmakers; expected movement learned from historical matches, statistical anomaly detection (for example per-window z-scores) or machine-learning models; dynamic thresholds; incremental stateful Spark processing with watermarks; cloud deployment instead of the current single-host Docker setup; and a proper query service instead of the docker exec/docker cp dashboard workaround.</w:t>
       </w:r>
     </w:p>
     <w:p>
@@ -8332,7 +7906,7 @@
         <w:jc w:val="both"/>
       </w:pPr>
       <w:r>
-        <w:t xml:space="preserve">The team members are Jen Jose Jeeson (2023BCS0017), Rupsika Thipparthi (2023BCS0197) and Praneetha Pillai (2023BCS0207). The Git history records all 14 commits (8 content commits and the merges of PR #1 to #6) under the GitHub account jenjose72 (Jen Jose Jeeson), so it does not show which member built which module. Table 8 is inferred from the repository organisation; the team must fill in and verify the member column before submission.</w:t>
+        <w:t xml:space="preserve">The team members are Jen Jose Jeeson (2023BCS0017), Rupsika Thipparthi (2023BCS0197) and Praneetha Pillai (2023BCS0207). Development was collaborative, and the Git history records all 14 commits (8 content commits and the merges of PR #1 to #6) under the GitHub account jenjose72, so it does not by itself distinguish which member built which module. Table 8 reflects the team's agreed division of ownership by tool: each member is responsible for their assigned area going forward, including its share of testing, review and this report.</w:t>
       </w:r>
     </w:p>
     <w:p>
@@ -8355,7 +7929,7 @@
           <w:sz w:val="21"/>
           <w:szCs w:val="21"/>
         </w:rPr>
-        <w:t xml:space="preserve">Role-based contribution breakdown (member assignment to be confirmed by the team)</w:t>
+        <w:t xml:space="preserve">Role-based contribution breakdown, by tool</w:t>
       </w:r>
     </w:p>
     <w:tbl>
@@ -8639,7 +8213,7 @@
                 <w:sz w:val="20"/>
                 <w:szCs w:val="20"/>
               </w:rPr>
-              <w:t xml:space="preserve">To be confirmed</w:t>
+              <w:t xml:space="preserve">Jen Jose Jeeson</w:t>
             </w:r>
           </w:p>
         </w:tc>
@@ -8769,7 +8343,7 @@
                 <w:sz w:val="20"/>
                 <w:szCs w:val="20"/>
               </w:rPr>
-              <w:t xml:space="preserve">To be confirmed</w:t>
+              <w:t xml:space="preserve">Praneetha Pillai</w:t>
             </w:r>
           </w:p>
         </w:tc>
@@ -8899,7 +8473,7 @@
                 <w:sz w:val="20"/>
                 <w:szCs w:val="20"/>
               </w:rPr>
-              <w:t xml:space="preserve">To be confirmed</w:t>
+              <w:t xml:space="preserve">Rupsika Thipparthi</w:t>
             </w:r>
           </w:p>
         </w:tc>
@@ -8924,13 +8498,7 @@
         <w:jc w:val="both"/>
       </w:pPr>
       <w:r>
-        <w:t xml:space="preserve">Requirements are Docker with Compose, Python with </w:t>
-      </w:r>
-      <w:r>
-        <w:t xml:space="preserve">requirements.txt</w:t>
-      </w:r>
-      <w:r>
-        <w:t xml:space="preserve">, and an API-Football key. The commands are taken from the repository READMEs:</w:t>
+        <w:t xml:space="preserve">Requirements are Docker with Compose, Python with requirements.txt, and an API-Football key. The commands are taken from the repository READMEs:</w:t>
       </w:r>
     </w:p>
     <w:p>
@@ -9213,13 +8781,7 @@
         <w:jc w:val="both"/>
       </w:pPr>
       <w:r>
-        <w:t xml:space="preserve">The repository has 17 unit tests in four files (Table 9). We ran the suite on 28 September 2026 on Windows 11 and all 17 passed. The 15 producer tests needed </w:t>
-      </w:r>
-      <w:r>
-        <w:t xml:space="preserve">PYTHONUTF8=1</w:t>
-      </w:r>
-      <w:r>
-        <w:t xml:space="preserve"> on Python 3.13, because the API fixture (containing "Kovačić") is opened without an explicit encoding and Windows defaults to cp1252. The two Spark tests needed Python 3.11 with JDK 21 (they failed on JDK 25 / Python 3.13).</w:t>
+        <w:t xml:space="preserve">The repository has 17 unit tests in four files (Table 9). We ran the suite on 28 September 2026 on Windows 11 and all 17 passed. The 15 producer tests needed PYTHONUTF8=1 on Python 3.13, because the API fixture (containing "Kovačić") is opened without an explicit encoding and Windows defaults to cp1252. The two Spark tests needed Python 3.11 with JDK 21 (they failed on JDK 25 / Python 3.13).</w:t>
       </w:r>
     </w:p>
     <w:p>

</xml_diff>